<commit_message>
Scrub identifying content from MBR companion doc (C&D compliance)
</commit_message>
<xml_diff>
--- a/posts/marketing-infrastructure-mbr/marketing-infrastructure-mbr-companion.docx
+++ b/posts/marketing-infrastructure-mbr/marketing-infrastructure-mbr-companion.docx
@@ -102,7 +102,7 @@
           <w:sz w:val="22"/>
           <w:szCs w:val="22"/>
         </w:rPr>
-        <w:t xml:space="preserve">Thirteen omni-channel marketing functions. More than ten data platforms. Zero unified view. A monthly reporting cycle that consumed more than 50 hours of collective team capacity just to aggregate numbers that already existed in dashboards no one had connected.</w:t>
+        <w:t>Multiple omni-channel marketing functions. More than ten data platforms. Zero unified view. A monthly reporting cycle that consumed significant collective team capacity just to aggregate numbers that already existed in dashboards no one had connected.</w:t>
       </w:r>
     </w:p>
     <w:p>
@@ -153,7 +153,7 @@
         <w:pStyle w:val="Heading2"/>
       </w:pPr>
       <w:r>
-        <w:t xml:space="preserve">No Operating System. Just Thirteen Calendars.</w:t>
+        <w:t>No Operating System. Just Too Many Calendars.</w:t>
       </w:r>
     </w:p>
     <w:p>
@@ -161,7 +161,7 @@
         <w:spacing w:after="200"/>
       </w:pPr>
       <w:r>
-        <w:t xml:space="preserve">A rapidly scaling technology company’s omni-channel marketing team had no unified reporting infrastructure. Thirteen distinct business functions… web operations, online rental, e-commerce DTC, marketplace channels, SEO, paid search, affiliates, organic social, email, SMS, digital asset management, promotional merchandise and regional programs… each reported in their own format, on their own timeline, from their own systems.</w:t>
+        <w:t>A rapidly scaling technology company’s omni-channel marketing team had no unified reporting infrastructure. Multiple distinct business functions… web operations, online rental, e-commerce DTC, marketplace channels, SEO, paid search, affiliates, organic social, email, SMS, digital asset management, promotional merchandise and regional programs… each reported in their own format, on their own timeline, from their own systems.</w:t>
       </w:r>
     </w:p>
     <w:p>
@@ -169,7 +169,7 @@
         <w:spacing w:after="200"/>
       </w:pPr>
       <w:r>
-        <w:t xml:space="preserve">Data lived across more than ten platforms: Looker Studio, Google Sheets, Shopify admin, GA4, Google Search Console, Klaviyo, Ahrefs, an inventory demand forecasting tool, Impact (affiliates), Chatmeter, CallRail and various internal spreadsheets. No single view existed of how these functions connected. No shared definitions. No standardized metrics cadence.</w:t>
+        <w:t>Data lived across more than ten platforms: analytics dashboards, spreadsheets, commerce admin, web analytics, search tools, email/SMS platforms, affiliate tracking, reputation management, call tracking and various internal spreadsheets. No single view existed of how these functions connected. No shared definitions. No standardized metrics cadence.</w:t>
       </w:r>
     </w:p>
     <w:p>
@@ -177,25 +177,22 @@
         <w:spacing w:after="200"/>
       </w:pPr>
       <w:r>
-        <w:t xml:space="preserve">The monthly business review was a manual aggregation exercise. Thirteen section owners were chased each month to pull numbers from dashboards and spreadsheets that already existed but weren’t consolidated. The MBR document was more tables than text… </w:t>
+        <w:t>The monthly business review was a manual aggregation exercise. Section owners were chased each month to pull numbers from dashboards and spreadsheets that already existed but weren’t consolidated. The MBR document was more tables than text… a collaborative doc doing the job of a dashboard. The majority of the MBR owner’s time was spent on administrative herding, not analysis or strategic insight.</w:t>
       </w:r>
       <w:r>
         <w:rPr>
           <w:b/>
           <w:bCs/>
         </w:rPr>
-        <w:t xml:space="preserve">a collaborative doc doing the job of a dashboard.</w:t>
-      </w:r>
-      <w:r>
-        <w:t xml:space="preserve"> The majority of the MBR owner’s time was spent on administrative herding, not analysis or strategic insight.</w:t>
-      </w:r>
+      </w:r>
+      <w:r/>
     </w:p>
     <w:p>
       <w:pPr>
         <w:spacing w:after="200"/>
       </w:pPr>
       <w:r>
-        <w:t xml:space="preserve">One critical commerce platform was particularly opaque. Only two people in the organization could extract real-time inventory and P&amp;L data from the backend. Anyone who needed those numbers submitted a request and waited. That interrupt-and-wait cycle created a bottleneck that affected every team with a stake in parts commerce.</w:t>
+        <w:t>One critical commerce platform was particularly opaque. A handful of people could extract real-time inventory and financial data from the backend. Anyone who needed those numbers submitted a request and waited. That interrupt-and-wait cycle created a bottleneck that affected every team with a stake in parts commerce.</w:t>
       </w:r>
     </w:p>
     <w:p>
@@ -203,25 +200,22 @@
         <w:spacing w:after="200"/>
       </w:pPr>
       <w:r>
-        <w:t xml:space="preserve">Section owners were in sprint-grind mode. Exhausted executors asked to suddenly become analytical reporters. The monthly cycle consumed an estimated </w:t>
+        <w:t>Section owners were in sprint-grind mode. Exhausted executors asked to suddenly become analytical reporters. The monthly cycle consumed an estimated significant collective team capacity across data gathering, entry, summary writing, definition creation and coordination overhead.</w:t>
       </w:r>
       <w:r>
         <w:rPr>
           <w:b/>
           <w:bCs/>
         </w:rPr>
-        <w:t xml:space="preserve">50-plus hours of collective team capacity</w:t>
-      </w:r>
-      <w:r>
-        <w:t xml:space="preserve"> across data gathering, entry, summary writing, definition creation and coordination overhead.</w:t>
-      </w:r>
+      </w:r>
+      <w:r/>
     </w:p>
     <w:p>
       <w:pPr>
         <w:spacing w:after="200"/>
       </w:pPr>
       <w:r>
-        <w:t xml:space="preserve">The $1B+ industrial technology company sat on a significant data asset with terrible data hygiene. Nobody was going to trust AI outputs built on unreliable, manually aggregated, once-a-month data. The prerequisite for broader AI adoption was a visible proof-of-concept that clean, consolidated, continuously updated data could actually work.</w:t>
+        <w:t>The company sat on a significant data asset with terrible data hygiene. Nobody was going to trust AI outputs built on unreliable, manually aggregated, once-a-month data. The prerequisite for broader AI adoption was a visible proof-of-concept that clean, consolidated, continuously updated data could actually work.</w:t>
       </w:r>
     </w:p>
     <w:p>
@@ -443,7 +437,7 @@
                 <w:sz w:val="20"/>
                 <w:szCs w:val="20"/>
               </w:rPr>
-              <w:t xml:space="preserve">Thirteen functions reporting independently. No shared cadence, no shared definitions, no consolidated view.</w:t>
+              <w:t>Multiple functions reporting independently. No shared cadence, no shared definitions, no consolidated view.</w:t>
             </w:r>
           </w:p>
         </w:tc>
@@ -531,7 +525,7 @@
                 <w:sz w:val="20"/>
                 <w:szCs w:val="20"/>
               </w:rPr>
-              <w:t xml:space="preserve">Real-time commerce data locked behind two people. Everyone else submitted requests and waited.</w:t>
+              <w:t>Real-time commerce data locked behind a small access group. Everyone else submitted requests and waited.</w:t>
             </w:r>
           </w:p>
         </w:tc>
@@ -619,7 +613,7 @@
                 <w:sz w:val="20"/>
                 <w:szCs w:val="20"/>
               </w:rPr>
-              <w:t xml:space="preserve">More than 50 hours per month of collective team capacity spent pulling numbers from disconnected dashboards.</w:t>
+              <w:t>Significant collective team capacity per month spent pulling numbers from disconnected dashboards.</w:t>
             </w:r>
           </w:p>
         </w:tc>
@@ -952,11 +946,9 @@
           <w:b/>
           <w:bCs/>
         </w:rPr>
-        <w:t xml:space="preserve">Capacity liberation. </w:t>
-      </w:r>
-      <w:r>
-        <w:t xml:space="preserve">Free 13-plus team members from manual data aggregation so they could do the higher-value work they never had time for.</w:t>
-      </w:r>
+        <w:t>Capacity liberation. Free team members from manual data aggregation so they could do the higher-value work they never had time for.</w:t>
+      </w:r>
+      <w:r/>
     </w:p>
     <w:p>
       <w:pPr>
@@ -992,11 +984,9 @@
           <w:b/>
           <w:bCs/>
         </w:rPr>
-        <w:t xml:space="preserve">Organizational change management. </w:t>
-      </w:r>
-      <w:r>
-        <w:t xml:space="preserve">Design the showcase to be useful enough that AI felt like a tool, not a mandate. Data democratization… moving from two gatekeepers to universal access… was the proof point that landed.</w:t>
-      </w:r>
+        <w:t>Organizational change management. Design the showcase to be useful enough that AI felt like a tool, not a mandate. Data democratization… moving from a few gatekeepers to universal access… was the proof point that landed.</w:t>
+      </w:r>
+      <w:r/>
     </w:p>
     <w:p>
       <w:pPr>
@@ -1027,7 +1017,7 @@
         <w:spacing w:after="200"/>
       </w:pPr>
       <w:r>
-        <w:t xml:space="preserve">Partnered with data analytics to connect more than ten platforms (Looker Studio, Google Sheets, Shopify, GA4, Google Search Console, Klaviyo, Ahrefs, inventory forecasting tools, Impact, Chatmeter, CallRail) into unified Looker dashboards with continuous data pulls instead of monthly manual extraction.</w:t>
+        <w:t>Partnered with data analytics to connect more than ten platforms (analytics dashboards, spreadsheets, commerce admin, web analytics, search tools, email/SMS platforms, affiliate tracking, reputation management, call tracking) into unified dashboards with continuous data pulls instead of monthly manual extraction.</w:t>
       </w:r>
     </w:p>
     <w:p>
@@ -1043,7 +1033,7 @@
         <w:spacing w:after="200"/>
       </w:pPr>
       <w:r>
-        <w:t xml:space="preserve">Moved real-time inventory and P&amp;L data from a two-person bottleneck into a dynamic dashboard anyone could view. The Slack-interrupt-and-wait cycle ended. A welcomed delete… not anger at the old system, just visible relief that it was gone.</w:t>
+        <w:t>Moved real-time inventory and P&amp;L data from a access bottleneck into a dynamic dashboard anyone could view. The interrupt-and-wait cycle ended. A welcomed delete… not anger at the old system, just visible relief that it was gone.</w:t>
       </w:r>
     </w:p>
     <w:p>
@@ -1059,7 +1049,7 @@
         <w:spacing w:after="200"/>
       </w:pPr>
       <w:r>
-        <w:t xml:space="preserve">Designed the MBR governance structure: section owners complete by the first Wednesday. Review on the first Thursday. Follow-ups noted, distributed via Slack to the announcements channel with a link to the master document. Follow-up owners respond in-thread and link responses back. Fixed timing. No ambiguity about who does what and when.</w:t>
+        <w:t>Designed the MBR governance structure: section owners complete by the first Wednesday. Review on the first Thursday. Follow-ups noted, distributed to the announcements channel with a link to the master document. Follow-up owners respond in-thread and link responses back. Fixed timing. No ambiguity about who does what and when.</w:t>
       </w:r>
     </w:p>
     <w:p>
@@ -1096,7 +1086,7 @@
         <w:pStyle w:val="Heading2"/>
       </w:pPr>
       <w:r>
-        <w:t xml:space="preserve">13 Sections Covering the Full Operation</w:t>
+        <w:t>Sections Covering the Full Operation</w:t>
       </w:r>
     </w:p>
     <w:p>
@@ -1358,7 +1348,7 @@
                 <w:sz w:val="18"/>
                 <w:szCs w:val="18"/>
               </w:rPr>
-              <w:t xml:space="preserve">GA4, Looker Studio</w:t>
+              <w:t>GA4, BI Dashboard</w:t>
             </w:r>
           </w:p>
         </w:tc>
@@ -1470,7 +1460,7 @@
                 <w:sz w:val="18"/>
                 <w:szCs w:val="18"/>
               </w:rPr>
-              <w:t xml:space="preserve">GA4, Looker Studio, Internal Orders</w:t>
+              <w:t>GA4, BI Dashboard, Internal Orders</w:t>
             </w:r>
           </w:p>
         </w:tc>
@@ -1582,7 +1572,7 @@
                 <w:sz w:val="18"/>
                 <w:szCs w:val="18"/>
               </w:rPr>
-              <w:t xml:space="preserve">Shopify, Looker Studio</w:t>
+              <w:t>Shopify, BI Dashboard</w:t>
             </w:r>
           </w:p>
         </w:tc>
@@ -2619,7 +2609,7 @@
                 <w:sz w:val="18"/>
                 <w:szCs w:val="18"/>
               </w:rPr>
-              <w:t xml:space="preserve">13</w:t>
+              <w:t>—</w:t>
             </w:r>
           </w:p>
         </w:tc>
@@ -2702,7 +2692,7 @@
                 <w:sz w:val="18"/>
                 <w:szCs w:val="18"/>
               </w:rPr>
-              <w:t xml:space="preserve">Looker Studio, Various</w:t>
+              <w:t>BI Dashboard, Various</w:t>
             </w:r>
           </w:p>
         </w:tc>
@@ -2739,7 +2729,7 @@
         <w:spacing w:after="120"/>
       </w:pPr>
       <w:r>
-        <w:t xml:space="preserve">13 functions unified on a single governance cadence for the first time</w:t>
+        <w:t>Multiple functions unified on a single governance cadence for the first time</w:t>
       </w:r>
     </w:p>
     <w:p>
@@ -2752,7 +2742,7 @@
         <w:spacing w:after="120"/>
       </w:pPr>
       <w:r>
-        <w:t xml:space="preserve">10+ data platforms consolidated into unified dashboard infrastructure</w:t>
+        <w:t>Multiple data platforms consolidated into unified dashboard infrastructure</w:t>
       </w:r>
     </w:p>
     <w:p>
@@ -2765,7 +2755,7 @@
         <w:spacing w:after="120"/>
       </w:pPr>
       <w:r>
-        <w:t xml:space="preserve">120+ cross-functional metrics visible in one view</w:t>
+        <w:t>More than 100 cross-functional metrics visible in one view</w:t>
       </w:r>
     </w:p>
     <w:p>
@@ -2778,7 +2768,7 @@
         <w:spacing w:after="120"/>
       </w:pPr>
       <w:r>
-        <w:t xml:space="preserve">Two-person data bottleneck for real-time commerce data eliminated entirely</w:t>
+        <w:t>Data access bottleneck for real-time commerce data eliminated entirely</w:t>
       </w:r>
     </w:p>
     <w:p>
@@ -2820,7 +2810,7 @@
         <w:spacing w:after="200"/>
       </w:pPr>
       <w:r>
-        <w:t xml:space="preserve">The director who championed this structure was terminated alongside more than 100 headquarters and executive employees. The MBR governance layer died with the sponsorship. The team was divided and reshuffled twice within six months.</w:t>
+        <w:t>The director who championed this structure was terminated alongside a significant number of headquarters and executive employees. The MBR governance layer died with the sponsorship. The team was divided and reshuffled twice within six months.</w:t>
       </w:r>
     </w:p>
     <w:p>

</xml_diff>

<commit_message>
Remove rental reference from MBR companion doc (C&D compliance)
</commit_message>
<xml_diff>
--- a/posts/marketing-infrastructure-mbr/marketing-infrastructure-mbr-companion.docx
+++ b/posts/marketing-infrastructure-mbr/marketing-infrastructure-mbr-companion.docx
@@ -161,7 +161,7 @@
         <w:spacing w:after="200"/>
       </w:pPr>
       <w:r>
-        <w:t>A rapidly scaling technology company’s omni-channel marketing team had no unified reporting infrastructure. Multiple distinct business functions… web operations, online rental, e-commerce DTC, marketplace channels, SEO, paid search, affiliates, organic social, email, SMS, digital asset management, promotional merchandise and regional programs… each reported in their own format, on their own timeline, from their own systems.</w:t>
+        <w:t>A rapidly scaling technology company’s omni-channel marketing team had no unified reporting infrastructure. Multiple distinct business functions… web operations, online platform, e-commerce DTC, marketplace channels, SEO, paid search, affiliates, organic social, email, SMS, digital asset management, promotional merchandise and regional programs… each reported in their own format, on their own timeline, from their own systems.</w:t>
       </w:r>
     </w:p>
     <w:p>
@@ -1405,7 +1405,7 @@
                 <w:sz w:val="18"/>
                 <w:szCs w:val="18"/>
               </w:rPr>
-              <w:t xml:space="preserve">Online Rental Experience</w:t>
+              <w:t>Online Platform Experience</w:t>
             </w:r>
           </w:p>
         </w:tc>

</xml_diff>